<commit_message>
Add confirmed device resets with prepaid re-enrollment
</commit_message>
<xml_diff>
--- a/docs/SYSTEM-GUIDE.docx
+++ b/docs/SYSTEM-GUIDE.docx
@@ -12,17 +12,7 @@
     </w:p>
     <w:p>
       <w:r>
-        <w:t xml:space="preserve">更新日期：2026 年 10 月 31 日 CST。适用代码：0.2.0，功能基线为已合并 main 的 </w:t>
-      </w:r>
-      <w:r>
-        <w:rPr>
-          <w:rFonts w:ascii="Consolas" w:hAnsi="Consolas"/>
-          <w:sz w:val="18"/>
-        </w:rPr>
-        <w:t>ec64319</w:t>
-      </w:r>
-      <w:r>
-        <w:t>。包版本不代表已发布 Git 标签或 npm 包。</w:t>
+        <w:t>更新日期：2026 年 10 月 31 日 CST。适用代码：0.3.0，包含设备自助重置与迁移 4。包版本不代表已发布 Git 标签或 npm 包。</w:t>
       </w:r>
     </w:p>
     <w:p>
@@ -1530,6 +1520,160 @@
                 <w:b w:val="0"/>
                 <w:sz w:val="18"/>
               </w:rPr>
+              <w:t>确认设备重置</w:t>
+            </w:r>
+          </w:p>
+        </w:tc>
+        <w:tc>
+          <w:tcPr>
+            <w:tcW w:type="dxa" w:w="3402"/>
+            <w:vAlign w:val="center"/>
+            <w:tcMar>
+              <w:top w:w="85" w:type="dxa"/>
+              <w:bottom w:w="85" w:type="dxa"/>
+              <w:left w:w="100" w:type="dxa"/>
+              <w:right w:w="100" w:type="dxa"/>
+            </w:tcMar>
+          </w:tcPr>
+          <w:p>
+            <w:pPr>
+              <w:spacing w:after="0" w:line="264" w:lineRule="auto"/>
+            </w:pPr>
+            <w:r>
+              <w:rPr>
+                <w:b w:val="0"/>
+                <w:sz w:val="18"/>
+              </w:rPr>
+              <w:t>免费优先，否则扣一次；旧设备停止续期</w:t>
+            </w:r>
+          </w:p>
+        </w:tc>
+        <w:tc>
+          <w:tcPr>
+            <w:tcW w:type="dxa" w:w="4762"/>
+            <w:vAlign w:val="center"/>
+            <w:tcMar>
+              <w:top w:w="85" w:type="dxa"/>
+              <w:bottom w:w="85" w:type="dxa"/>
+              <w:left w:w="100" w:type="dxa"/>
+              <w:right w:w="100" w:type="dxa"/>
+            </w:tcMar>
+          </w:tcPr>
+          <w:p>
+            <w:pPr>
+              <w:spacing w:after="0" w:line="264" w:lineRule="auto"/>
+            </w:pPr>
+            <w:r>
+              <w:rPr>
+                <w:b w:val="0"/>
+                <w:sz w:val="18"/>
+              </w:rPr>
+              <w:t>从重置时重新开始</w:t>
+            </w:r>
+          </w:p>
+        </w:tc>
+      </w:tr>
+      <w:tr>
+        <w:trPr>
+          <w:cantSplit/>
+        </w:trPr>
+        <w:tc>
+          <w:tcPr>
+            <w:tcW w:type="dxa" w:w="1701"/>
+            <w:vAlign w:val="center"/>
+            <w:tcMar>
+              <w:top w:w="85" w:type="dxa"/>
+              <w:bottom w:w="85" w:type="dxa"/>
+              <w:left w:w="100" w:type="dxa"/>
+              <w:right w:w="100" w:type="dxa"/>
+            </w:tcMar>
+          </w:tcPr>
+          <w:p>
+            <w:pPr>
+              <w:spacing w:after="0" w:line="264" w:lineRule="auto"/>
+            </w:pPr>
+            <w:r>
+              <w:rPr>
+                <w:b w:val="0"/>
+                <w:sz w:val="18"/>
+              </w:rPr>
+              <w:t>重置后首次绑定</w:t>
+            </w:r>
+          </w:p>
+        </w:tc>
+        <w:tc>
+          <w:tcPr>
+            <w:tcW w:type="dxa" w:w="3402"/>
+            <w:vAlign w:val="center"/>
+            <w:tcMar>
+              <w:top w:w="85" w:type="dxa"/>
+              <w:bottom w:w="85" w:type="dxa"/>
+              <w:left w:w="100" w:type="dxa"/>
+              <w:right w:w="100" w:type="dxa"/>
+            </w:tcMar>
+          </w:tcPr>
+          <w:p>
+            <w:pPr>
+              <w:spacing w:after="0" w:line="264" w:lineRule="auto"/>
+            </w:pPr>
+            <w:r>
+              <w:rPr>
+                <w:b w:val="0"/>
+                <w:sz w:val="18"/>
+              </w:rPr>
+              <w:t>已处理额度，不再次扣除</w:t>
+            </w:r>
+          </w:p>
+        </w:tc>
+        <w:tc>
+          <w:tcPr>
+            <w:tcW w:type="dxa" w:w="4762"/>
+            <w:vAlign w:val="center"/>
+            <w:tcMar>
+              <w:top w:w="85" w:type="dxa"/>
+              <w:bottom w:w="85" w:type="dxa"/>
+              <w:left w:w="100" w:type="dxa"/>
+              <w:right w:w="100" w:type="dxa"/>
+            </w:tcMar>
+          </w:tcPr>
+          <w:p>
+            <w:pPr>
+              <w:spacing w:after="0" w:line="264" w:lineRule="auto"/>
+            </w:pPr>
+            <w:r>
+              <w:rPr>
+                <w:b w:val="0"/>
+                <w:sz w:val="18"/>
+              </w:rPr>
+              <w:t>保留重置时的冷却</w:t>
+            </w:r>
+          </w:p>
+        </w:tc>
+      </w:tr>
+      <w:tr>
+        <w:trPr>
+          <w:cantSplit/>
+        </w:trPr>
+        <w:tc>
+          <w:tcPr>
+            <w:tcW w:type="dxa" w:w="1701"/>
+            <w:vAlign w:val="center"/>
+            <w:tcMar>
+              <w:top w:w="85" w:type="dxa"/>
+              <w:bottom w:w="85" w:type="dxa"/>
+              <w:left w:w="100" w:type="dxa"/>
+              <w:right w:w="100" w:type="dxa"/>
+            </w:tcMar>
+          </w:tcPr>
+          <w:p>
+            <w:pPr>
+              <w:spacing w:after="0" w:line="264" w:lineRule="auto"/>
+            </w:pPr>
+            <w:r>
+              <w:rPr>
+                <w:b w:val="0"/>
+                <w:sz w:val="18"/>
+              </w:rPr>
               <w:t>购买或赠送次数</w:t>
             </w:r>
           </w:p>
@@ -1750,7 +1894,7 @@
     </w:p>
     <w:p>
       <w:r>
-        <w:t>设备公钥丢失不能仅凭相同 HWID 自动恢复。换绑、额度扣减、挑战消费与审计在同一事务提交，失败回滚；需要重试的命令使用幂等键。</w:t>
+        <w:t>自助重置须核对当前绑定代次和本次费用，重复请求不重复扣减；未绑定或正在等待重新绑定时不可再次重置。旧挑战失效，已有离线许可证仍可持续至原到期时间。设备公钥丢失不能仅凭相同 HWID 自动恢复。换绑、额度扣减、挑战消费与审计在同一事务提交，失败回滚；需要重试的命令使用幂等键。</w:t>
       </w:r>
     </w:p>
     <w:p>
@@ -2525,12 +2669,12 @@
     </w:p>
     <w:p>
       <w:r>
-        <w:t>功能基线 ec64319 已经由 PR #6 合入 main，包含此前安全修复。最近一次本地构建和 49 项测试通过，生产依赖审计未报告已知漏洞。GitHub Actions 曾明确因账号计费锁定而未启动；本地成功不代表远端 CI 通过，也不代表完成真实产品支付或硬件验收。</w:t>
+        <w:t>本次新增设备重置预览与确认、一次扣费后的待绑定状态和迁移 4。本地构建和 54 项测试通过；此前生产依赖审计未报告已知漏洞。GitHub Actions 曾明确因账号计费锁定而未启动；本地成功不代表远端 CI 通过，也不代表完成真实产品支付或硬件验收。</w:t>
       </w:r>
     </w:p>
     <w:p>
       <w:r>
-        <w:t>当前提交版本为 0.2.0，未据此创建发布标签。Git main 保存集成代码，短期分支通过 PR 合并。收费版本、软件构建版本、分发渠道与 Git 分支相互独立；运行数据库、私钥、环境配置和客户文件不得进入 Git。</w:t>
+        <w:t>当前提交版本为 0.3.0，未据此创建发布标签。Git main 保存集成代码，短期分支通过 PR 合并。收费版本、软件构建版本、分发渠道与 Git 分支相互独立；运行数据库、私钥、环境配置和客户文件不得进入 Git。</w:t>
       </w:r>
     </w:p>
     <w:p>

</xml_diff>

<commit_message>
Add confirmed device resets with prepaid re-enrollment (#8)
</commit_message>
<xml_diff>
--- a/docs/SYSTEM-GUIDE.docx
+++ b/docs/SYSTEM-GUIDE.docx
@@ -12,17 +12,7 @@
     </w:p>
     <w:p>
       <w:r>
-        <w:t xml:space="preserve">更新日期：2026 年 10 月 31 日 CST。适用代码：0.2.0，功能基线为已合并 main 的 </w:t>
-      </w:r>
-      <w:r>
-        <w:rPr>
-          <w:rFonts w:ascii="Consolas" w:hAnsi="Consolas"/>
-          <w:sz w:val="18"/>
-        </w:rPr>
-        <w:t>ec64319</w:t>
-      </w:r>
-      <w:r>
-        <w:t>。包版本不代表已发布 Git 标签或 npm 包。</w:t>
+        <w:t>更新日期：2026 年 10 月 31 日 CST。适用代码：0.3.0，包含设备自助重置与迁移 4。包版本不代表已发布 Git 标签或 npm 包。</w:t>
       </w:r>
     </w:p>
     <w:p>
@@ -1530,6 +1520,160 @@
                 <w:b w:val="0"/>
                 <w:sz w:val="18"/>
               </w:rPr>
+              <w:t>确认设备重置</w:t>
+            </w:r>
+          </w:p>
+        </w:tc>
+        <w:tc>
+          <w:tcPr>
+            <w:tcW w:type="dxa" w:w="3402"/>
+            <w:vAlign w:val="center"/>
+            <w:tcMar>
+              <w:top w:w="85" w:type="dxa"/>
+              <w:bottom w:w="85" w:type="dxa"/>
+              <w:left w:w="100" w:type="dxa"/>
+              <w:right w:w="100" w:type="dxa"/>
+            </w:tcMar>
+          </w:tcPr>
+          <w:p>
+            <w:pPr>
+              <w:spacing w:after="0" w:line="264" w:lineRule="auto"/>
+            </w:pPr>
+            <w:r>
+              <w:rPr>
+                <w:b w:val="0"/>
+                <w:sz w:val="18"/>
+              </w:rPr>
+              <w:t>免费优先，否则扣一次；旧设备停止续期</w:t>
+            </w:r>
+          </w:p>
+        </w:tc>
+        <w:tc>
+          <w:tcPr>
+            <w:tcW w:type="dxa" w:w="4762"/>
+            <w:vAlign w:val="center"/>
+            <w:tcMar>
+              <w:top w:w="85" w:type="dxa"/>
+              <w:bottom w:w="85" w:type="dxa"/>
+              <w:left w:w="100" w:type="dxa"/>
+              <w:right w:w="100" w:type="dxa"/>
+            </w:tcMar>
+          </w:tcPr>
+          <w:p>
+            <w:pPr>
+              <w:spacing w:after="0" w:line="264" w:lineRule="auto"/>
+            </w:pPr>
+            <w:r>
+              <w:rPr>
+                <w:b w:val="0"/>
+                <w:sz w:val="18"/>
+              </w:rPr>
+              <w:t>从重置时重新开始</w:t>
+            </w:r>
+          </w:p>
+        </w:tc>
+      </w:tr>
+      <w:tr>
+        <w:trPr>
+          <w:cantSplit/>
+        </w:trPr>
+        <w:tc>
+          <w:tcPr>
+            <w:tcW w:type="dxa" w:w="1701"/>
+            <w:vAlign w:val="center"/>
+            <w:tcMar>
+              <w:top w:w="85" w:type="dxa"/>
+              <w:bottom w:w="85" w:type="dxa"/>
+              <w:left w:w="100" w:type="dxa"/>
+              <w:right w:w="100" w:type="dxa"/>
+            </w:tcMar>
+          </w:tcPr>
+          <w:p>
+            <w:pPr>
+              <w:spacing w:after="0" w:line="264" w:lineRule="auto"/>
+            </w:pPr>
+            <w:r>
+              <w:rPr>
+                <w:b w:val="0"/>
+                <w:sz w:val="18"/>
+              </w:rPr>
+              <w:t>重置后首次绑定</w:t>
+            </w:r>
+          </w:p>
+        </w:tc>
+        <w:tc>
+          <w:tcPr>
+            <w:tcW w:type="dxa" w:w="3402"/>
+            <w:vAlign w:val="center"/>
+            <w:tcMar>
+              <w:top w:w="85" w:type="dxa"/>
+              <w:bottom w:w="85" w:type="dxa"/>
+              <w:left w:w="100" w:type="dxa"/>
+              <w:right w:w="100" w:type="dxa"/>
+            </w:tcMar>
+          </w:tcPr>
+          <w:p>
+            <w:pPr>
+              <w:spacing w:after="0" w:line="264" w:lineRule="auto"/>
+            </w:pPr>
+            <w:r>
+              <w:rPr>
+                <w:b w:val="0"/>
+                <w:sz w:val="18"/>
+              </w:rPr>
+              <w:t>已处理额度，不再次扣除</w:t>
+            </w:r>
+          </w:p>
+        </w:tc>
+        <w:tc>
+          <w:tcPr>
+            <w:tcW w:type="dxa" w:w="4762"/>
+            <w:vAlign w:val="center"/>
+            <w:tcMar>
+              <w:top w:w="85" w:type="dxa"/>
+              <w:bottom w:w="85" w:type="dxa"/>
+              <w:left w:w="100" w:type="dxa"/>
+              <w:right w:w="100" w:type="dxa"/>
+            </w:tcMar>
+          </w:tcPr>
+          <w:p>
+            <w:pPr>
+              <w:spacing w:after="0" w:line="264" w:lineRule="auto"/>
+            </w:pPr>
+            <w:r>
+              <w:rPr>
+                <w:b w:val="0"/>
+                <w:sz w:val="18"/>
+              </w:rPr>
+              <w:t>保留重置时的冷却</w:t>
+            </w:r>
+          </w:p>
+        </w:tc>
+      </w:tr>
+      <w:tr>
+        <w:trPr>
+          <w:cantSplit/>
+        </w:trPr>
+        <w:tc>
+          <w:tcPr>
+            <w:tcW w:type="dxa" w:w="1701"/>
+            <w:vAlign w:val="center"/>
+            <w:tcMar>
+              <w:top w:w="85" w:type="dxa"/>
+              <w:bottom w:w="85" w:type="dxa"/>
+              <w:left w:w="100" w:type="dxa"/>
+              <w:right w:w="100" w:type="dxa"/>
+            </w:tcMar>
+          </w:tcPr>
+          <w:p>
+            <w:pPr>
+              <w:spacing w:after="0" w:line="264" w:lineRule="auto"/>
+            </w:pPr>
+            <w:r>
+              <w:rPr>
+                <w:b w:val="0"/>
+                <w:sz w:val="18"/>
+              </w:rPr>
               <w:t>购买或赠送次数</w:t>
             </w:r>
           </w:p>
@@ -1750,7 +1894,7 @@
     </w:p>
     <w:p>
       <w:r>
-        <w:t>设备公钥丢失不能仅凭相同 HWID 自动恢复。换绑、额度扣减、挑战消费与审计在同一事务提交，失败回滚；需要重试的命令使用幂等键。</w:t>
+        <w:t>自助重置须核对当前绑定代次和本次费用，重复请求不重复扣减；未绑定或正在等待重新绑定时不可再次重置。旧挑战失效，已有离线许可证仍可持续至原到期时间。设备公钥丢失不能仅凭相同 HWID 自动恢复。换绑、额度扣减、挑战消费与审计在同一事务提交，失败回滚；需要重试的命令使用幂等键。</w:t>
       </w:r>
     </w:p>
     <w:p>
@@ -2525,12 +2669,12 @@
     </w:p>
     <w:p>
       <w:r>
-        <w:t>功能基线 ec64319 已经由 PR #6 合入 main，包含此前安全修复。最近一次本地构建和 49 项测试通过，生产依赖审计未报告已知漏洞。GitHub Actions 曾明确因账号计费锁定而未启动；本地成功不代表远端 CI 通过，也不代表完成真实产品支付或硬件验收。</w:t>
+        <w:t>本次新增设备重置预览与确认、一次扣费后的待绑定状态和迁移 4。本地构建和 54 项测试通过；此前生产依赖审计未报告已知漏洞。GitHub Actions 曾明确因账号计费锁定而未启动；本地成功不代表远端 CI 通过，也不代表完成真实产品支付或硬件验收。</w:t>
       </w:r>
     </w:p>
     <w:p>
       <w:r>
-        <w:t>当前提交版本为 0.2.0，未据此创建发布标签。Git main 保存集成代码，短期分支通过 PR 合并。收费版本、软件构建版本、分发渠道与 Git 分支相互独立；运行数据库、私钥、环境配置和客户文件不得进入 Git。</w:t>
+        <w:t>当前提交版本为 0.3.0，未据此创建发布标签。Git main 保存集成代码，短期分支通过 PR 合并。收费版本、软件构建版本、分发渠道与 Git 分支相互独立；运行数据库、私钥、环境配置和客户文件不得进入 Git。</w:t>
       </w:r>
     </w:p>
     <w:p>

</xml_diff>

<commit_message>
feat: add order expiry and reviewed late payment handling
</commit_message>
<xml_diff>
--- a/docs/SYSTEM-GUIDE.docx
+++ b/docs/SYSTEM-GUIDE.docx
@@ -12,7 +12,7 @@
     </w:p>
     <w:p>
       <w:r>
-        <w:t>更新日期：2026 年 10 月 31 日 CST。适用代码：0.3.0，包含设备自助重置与迁移 4。包版本不代表已发布 Git 标签或 npm 包。</w:t>
+        <w:t>更新日期：2026 年 10 月 31 日 CST。适用代码：0.4.0，包含设备自助重置、订单有效期与迁移 5。包版本不代表已发布 Git 标签或 npm 包。</w:t>
       </w:r>
     </w:p>
     <w:p>
@@ -1144,6 +1144,16 @@
     </w:p>
     <w:p>
       <w:r>
+        <w:t>新订单默认 24 小时有效，宿主可通过 orderTtlSeconds 配置 60 秒至 30 天。升级前的待付款订单从首次升级时获得完整宽限期。order_deadlines 使用独立附表，保留现有订单和外键结构。即使定时任务尚未执行，查询和确认付款仍即时检查有效期。</w:t>
+      </w:r>
+    </w:p>
+    <w:p>
+      <w:r>
+        <w:t>过期订单显示 expired，清理后底层状态为 cancelled 并保留过期原因和审计。人工取消与自动过期分开处理；人工取消不可重新发放。过期后确实到账，管理员须核实金额、币种和唯一流水并提供 latePaymentReason 后才能发放，原资格检查依旧有效。无法发放或金额不符须人工退款/协商，系统不会伪造退款结果。</w:t>
+      </w:r>
+    </w:p>
+    <w:p>
+      <w:r>
         <w:t>订单保存商品和价格快照，金额为最小货币单位整数。调价只影响之后创建的订单。人工核实须依据真实收款记录，提交渠道、交易流水、金额和币种；付款截图、客户端提示和跳转成功均不是支付凭证。</w:t>
       </w:r>
     </w:p>
@@ -1895,11 +1905,6 @@
     <w:p>
       <w:r>
         <w:t>自助重置须核对当前绑定代次和本次费用，重复请求不重复扣减；未绑定或正在等待重新绑定时不可再次重置。旧挑战失效，已有离线许可证仍可持续至原到期时间。设备公钥丢失不能仅凭相同 HWID 自动恢复。换绑、额度扣减、挑战消费与审计在同一事务提交，失败回滚；需要重试的命令使用幂等键。</w:t>
-      </w:r>
-    </w:p>
-    <w:p>
-      <w:r>
-        <w:br w:type="page"/>
       </w:r>
     </w:p>
     <w:p>
@@ -2656,7 +2661,7 @@
     </w:p>
     <w:p>
       <w:r>
-        <w:t>维护前停止服务。使用受限口令文件执行 backup、restore 或 rotate-signing，口令不写命令行参数。备份采用认证加密，恢复只写新目录。核对 schema、目录配置、账号权益、设备冷却和密钥后再切换；不能直接复制正在写入的 SQLite 主文件并忽略 WAL。</w:t>
+        <w:t>维护前停止服务。使用受限口令文件执行 backup、restore 或 rotate-signing，口令不写命令行参数。备份采用认证加密，恢复只写新目录。原始文件总量上限为 256 MiB，仍兼容旧备份格式；这是有容量边界的内存实现，大规模制品不得塞进业务备份。核对 schema、目录配置、账号权益、设备冷却和密钥后再切换；不能直接复制正在写入的 SQLite 主文件并忽略 WAL。</w:t>
       </w:r>
     </w:p>
     <w:p>
@@ -2669,12 +2674,12 @@
     </w:p>
     <w:p>
       <w:r>
-        <w:t>本次新增设备重置预览与确认、一次扣费后的待绑定状态和迁移 4。本地构建和 54 项测试通过；此前生产依赖审计未报告已知漏洞。GitHub Actions 曾明确因账号计费锁定而未启动；本地成功不代表远端 CI 通过，也不代表完成真实产品支付或硬件验收。</w:t>
+        <w:t>本次新增订单有效期、过期支付复核、迁移 5 与备份容量扩展。本地构建和 57 项测试通过；此前生产依赖审计未报告已知漏洞。GitHub Actions 曾明确因账号计费锁定而未启动；本地成功不代表远端 CI 通过，也不代表完成真实产品支付或硬件验收。</w:t>
       </w:r>
     </w:p>
     <w:p>
       <w:r>
-        <w:t>当前提交版本为 0.3.0，未据此创建发布标签。Git main 保存集成代码，短期分支通过 PR 合并。收费版本、软件构建版本、分发渠道与 Git 分支相互独立；运行数据库、私钥、环境配置和客户文件不得进入 Git。</w:t>
+        <w:t>当前提交版本为 0.4.0，未据此创建发布标签。Git main 保存集成代码，短期分支通过 PR 合并。收费版本、软件构建版本、分发渠道与 Git 分支相互独立；运行数据库、私钥、环境配置和客户文件不得进入 Git。</w:t>
       </w:r>
     </w:p>
     <w:p>

</xml_diff>

<commit_message>
feat: add order expiry and reviewed late payment handling (#9)
</commit_message>
<xml_diff>
--- a/docs/SYSTEM-GUIDE.docx
+++ b/docs/SYSTEM-GUIDE.docx
@@ -12,7 +12,7 @@
     </w:p>
     <w:p>
       <w:r>
-        <w:t>更新日期：2026 年 10 月 31 日 CST。适用代码：0.3.0，包含设备自助重置与迁移 4。包版本不代表已发布 Git 标签或 npm 包。</w:t>
+        <w:t>更新日期：2026 年 10 月 31 日 CST。适用代码：0.4.0，包含设备自助重置、订单有效期与迁移 5。包版本不代表已发布 Git 标签或 npm 包。</w:t>
       </w:r>
     </w:p>
     <w:p>
@@ -1144,6 +1144,16 @@
     </w:p>
     <w:p>
       <w:r>
+        <w:t>新订单默认 24 小时有效，宿主可通过 orderTtlSeconds 配置 60 秒至 30 天。升级前的待付款订单从首次升级时获得完整宽限期。order_deadlines 使用独立附表，保留现有订单和外键结构。即使定时任务尚未执行，查询和确认付款仍即时检查有效期。</w:t>
+      </w:r>
+    </w:p>
+    <w:p>
+      <w:r>
+        <w:t>过期订单显示 expired，清理后底层状态为 cancelled 并保留过期原因和审计。人工取消与自动过期分开处理；人工取消不可重新发放。过期后确实到账，管理员须核实金额、币种和唯一流水并提供 latePaymentReason 后才能发放，原资格检查依旧有效。无法发放或金额不符须人工退款/协商，系统不会伪造退款结果。</w:t>
+      </w:r>
+    </w:p>
+    <w:p>
+      <w:r>
         <w:t>订单保存商品和价格快照，金额为最小货币单位整数。调价只影响之后创建的订单。人工核实须依据真实收款记录，提交渠道、交易流水、金额和币种；付款截图、客户端提示和跳转成功均不是支付凭证。</w:t>
       </w:r>
     </w:p>
@@ -1895,11 +1905,6 @@
     <w:p>
       <w:r>
         <w:t>自助重置须核对当前绑定代次和本次费用，重复请求不重复扣减；未绑定或正在等待重新绑定时不可再次重置。旧挑战失效，已有离线许可证仍可持续至原到期时间。设备公钥丢失不能仅凭相同 HWID 自动恢复。换绑、额度扣减、挑战消费与审计在同一事务提交，失败回滚；需要重试的命令使用幂等键。</w:t>
-      </w:r>
-    </w:p>
-    <w:p>
-      <w:r>
-        <w:br w:type="page"/>
       </w:r>
     </w:p>
     <w:p>
@@ -2656,7 +2661,7 @@
     </w:p>
     <w:p>
       <w:r>
-        <w:t>维护前停止服务。使用受限口令文件执行 backup、restore 或 rotate-signing，口令不写命令行参数。备份采用认证加密，恢复只写新目录。核对 schema、目录配置、账号权益、设备冷却和密钥后再切换；不能直接复制正在写入的 SQLite 主文件并忽略 WAL。</w:t>
+        <w:t>维护前停止服务。使用受限口令文件执行 backup、restore 或 rotate-signing，口令不写命令行参数。备份采用认证加密，恢复只写新目录。原始文件总量上限为 256 MiB，仍兼容旧备份格式；这是有容量边界的内存实现，大规模制品不得塞进业务备份。核对 schema、目录配置、账号权益、设备冷却和密钥后再切换；不能直接复制正在写入的 SQLite 主文件并忽略 WAL。</w:t>
       </w:r>
     </w:p>
     <w:p>
@@ -2669,12 +2674,12 @@
     </w:p>
     <w:p>
       <w:r>
-        <w:t>本次新增设备重置预览与确认、一次扣费后的待绑定状态和迁移 4。本地构建和 54 项测试通过；此前生产依赖审计未报告已知漏洞。GitHub Actions 曾明确因账号计费锁定而未启动；本地成功不代表远端 CI 通过，也不代表完成真实产品支付或硬件验收。</w:t>
+        <w:t>本次新增订单有效期、过期支付复核、迁移 5 与备份容量扩展。本地构建和 57 项测试通过；此前生产依赖审计未报告已知漏洞。GitHub Actions 曾明确因账号计费锁定而未启动；本地成功不代表远端 CI 通过，也不代表完成真实产品支付或硬件验收。</w:t>
       </w:r>
     </w:p>
     <w:p>
       <w:r>
-        <w:t>当前提交版本为 0.3.0，未据此创建发布标签。Git main 保存集成代码，短期分支通过 PR 合并。收费版本、软件构建版本、分发渠道与 Git 分支相互独立；运行数据库、私钥、环境配置和客户文件不得进入 Git。</w:t>
+        <w:t>当前提交版本为 0.4.0，未据此创建发布标签。Git main 保存集成代码，短期分支通过 PR 合并。收费版本、软件构建版本、分发渠道与 Git 分支相互独立；运行数据库、私钥、环境配置和客户文件不得进入 Git。</w:t>
       </w:r>
     </w:p>
     <w:p>

</xml_diff>

<commit_message>
docs: record the published v0.4.0 release tag
</commit_message>
<xml_diff>
--- a/docs/SYSTEM-GUIDE.docx
+++ b/docs/SYSTEM-GUIDE.docx
@@ -12,7 +12,7 @@
     </w:p>
     <w:p>
       <w:r>
-        <w:t>更新日期：2026 年 10 月 31 日 CST。适用代码：0.4.0，包含设备自助重置、订单有效期与迁移 5。包版本不代表已发布 Git 标签或 npm 包。</w:t>
+        <w:t>更新日期：2026 年 10 月 31 日 CST。适用代码：0.4.0，包含设备自助重置、订单有效期与迁移 5。已发布 Git 标签 v0.4.0，未发布 npm 包。</w:t>
       </w:r>
     </w:p>
     <w:p>
@@ -2679,7 +2679,7 @@
     </w:p>
     <w:p>
       <w:r>
-        <w:t>当前提交版本为 0.4.0，未据此创建发布标签。Git main 保存集成代码，短期分支通过 PR 合并。收费版本、软件构建版本、分发渠道与 Git 分支相互独立；运行数据库、私钥、环境配置和客户文件不得进入 Git。</w:t>
+        <w:t>当前代码版本为 0.4.0，Git 标签 v0.4.0 固定该版本的功能提交。Git main 保存集成代码，短期分支通过 PR 合并。收费版本、软件构建版本、分发渠道与 Git 分支相互独立；运行数据库、私钥、环境配置和客户文件不得进入 Git。</w:t>
       </w:r>
     </w:p>
     <w:p>

</xml_diff>

<commit_message>
docs: record the published v0.4.0 release tag (#10)
</commit_message>
<xml_diff>
--- a/docs/SYSTEM-GUIDE.docx
+++ b/docs/SYSTEM-GUIDE.docx
@@ -12,7 +12,7 @@
     </w:p>
     <w:p>
       <w:r>
-        <w:t>更新日期：2026 年 10 月 31 日 CST。适用代码：0.4.0，包含设备自助重置、订单有效期与迁移 5。包版本不代表已发布 Git 标签或 npm 包。</w:t>
+        <w:t>更新日期：2026 年 10 月 31 日 CST。适用代码：0.4.0，包含设备自助重置、订单有效期与迁移 5。已发布 Git 标签 v0.4.0，未发布 npm 包。</w:t>
       </w:r>
     </w:p>
     <w:p>
@@ -2679,7 +2679,7 @@
     </w:p>
     <w:p>
       <w:r>
-        <w:t>当前提交版本为 0.4.0，未据此创建发布标签。Git main 保存集成代码，短期分支通过 PR 合并。收费版本、软件构建版本、分发渠道与 Git 分支相互独立；运行数据库、私钥、环境配置和客户文件不得进入 Git。</w:t>
+        <w:t>当前代码版本为 0.4.0，Git 标签 v0.4.0 固定该版本的功能提交。Git main 保存集成代码，短期分支通过 PR 合并。收费版本、软件构建版本、分发渠道与 Git 分支相互独立；运行数据库、私钥、环境配置和客户文件不得进入 Git。</w:t>
       </w:r>
     </w:p>
     <w:p>

</xml_diff>

<commit_message>
fix: enforce device and license scope and reconcile exceptional payments
</commit_message>
<xml_diff>
--- a/docs/SYSTEM-GUIDE.docx
+++ b/docs/SYSTEM-GUIDE.docx
@@ -12,7 +12,7 @@
     </w:p>
     <w:p>
       <w:r>
-        <w:t>更新日期：2026 年 10 月 31 日 CST。适用代码：0.4.0，包含设备自助重置、订单有效期与迁移 5。已发布 Git 标签 v0.4.0，未发布 npm 包。</w:t>
+        <w:t>更新日期：2026 年 10 月 31 日 CST。适用代码：0.5.0，包含安全恢复、渠道许可证、异常到账和迁移 6。Git 标签固定发布版本，未发布 npm 包。</w:t>
       </w:r>
     </w:p>
     <w:p>
@@ -1114,7 +1114,7 @@
         <w:t>hasReleaseAccess</w:t>
       </w:r>
       <w:r>
-        <w:t xml:space="preserve"> 检查账号状态、有效版本权益和同版渠道资格。实际下载服务必须调用渠道鉴权；当前设备许可证不携带 Beta 条件，不能把发布说明过滤当作完整客户端渠道保护。</w:t>
+        <w:t xml:space="preserve"> 检查账号状态、有效版本权益和同版渠道资格。实际下载服务必须调用渠道鉴权；许可证也签入 stable/beta 渠道和硬件摘要；签发与 SDK 验证都检查范围。撤销版本权益会清除 Beta，重新购买普通版不恢复旧 Beta。</w:t>
       </w:r>
     </w:p>
     <w:p>
@@ -1144,22 +1144,17 @@
     </w:p>
     <w:p>
       <w:r>
-        <w:t>新订单默认 24 小时有效，宿主可通过 orderTtlSeconds 配置 60 秒至 30 天。升级前的待付款订单从首次升级时获得完整宽限期。order_deadlines 使用独立附表，保留现有订单和外键结构。即使定时任务尚未执行，查询和确认付款仍即时检查有效期。</w:t>
+        <w:t>订单默认 24 小时有效，可配置 60 秒至 30 天。旧待付订单在首次升级时取得完整宽限期。独立附表保存截止时间；查询及核款即时检查，不依赖定时清理。</w:t>
       </w:r>
     </w:p>
     <w:p>
       <w:r>
-        <w:t>过期订单显示 expired，清理后底层状态为 cancelled 并保留过期原因和审计。人工取消与自动过期分开处理；人工取消不可重新发放。过期后确实到账，管理员须核实金额、币种和唯一流水并提供 latePaymentReason 后才能发放，原资格检查依旧有效。无法发放或金额不符须人工退款/协商，系统不会伪造退款结果。</w:t>
+        <w:t>人工取消与过期分开处理。取消订单不能直接发放；过期单须提供 latePaymentReason。核款必须验证实际收款、金额、币种、唯一流水及购买资格。价格保存为订单快照，调价不改变旧单。</w:t>
       </w:r>
     </w:p>
     <w:p>
       <w:r>
-        <w:t>订单保存商品和价格快照，金额为最小货币单位整数。调价只影响之后创建的订单。人工核实须依据真实收款记录，提交渠道、交易流水、金额和币种；付款截图、客户端提示和跳转成功均不是支付凭证。</w:t>
-      </w:r>
-    </w:p>
-    <w:p>
-      <w:r>
-        <w:t>订单确认、权益或额度发放、审计和通知事件在事务中完成。渠道与流水号唯一，重复确认同一交易不重复发放；不同交易确认已支付订单产生冲突。两笔订单重复购买同一版本时，不重复授予权益，多付金额需要运营处理。当前没有退款和自动对账实现。</w:t>
+        <w:t>确认、发放、审计与通知在同一事务完成。异常到账先独立登记，再用于同账号新订单，或登记已完成的人工退款。订单与异常记录间统一防重用。系统不执行自动退款，也不把付款截图当作到账证据。</w:t>
       </w:r>
     </w:p>
     <w:p>
@@ -1172,7 +1167,7 @@
     </w:p>
     <w:p>
       <w:r>
-        <w:t>每个账号在每个设备组只保留一台有效设备。同组产品共享设备、冷却与额外额度；不同组独立。硬件摘要只作关联信息，激活必须验证设备 Ed25519 私钥持有证明。</w:t>
+        <w:t>同组产品共享一台有效设备、冷却与额度，不同组独立。激活验证 Ed25519 私钥；同密钥但摘要变化按换绑处理。私钥与摘要同时复制仍须由原生端可信硬件措施解决。</w:t>
       </w:r>
     </w:p>
     <w:tbl>
@@ -1347,7 +1342,7 @@
                 <w:b w:val="0"/>
                 <w:sz w:val="18"/>
               </w:rPr>
-              <w:t>开始配置的自然月冷却</w:t>
+              <w:t>开始自然月冷却</w:t>
             </w:r>
           </w:p>
         </w:tc>
@@ -1400,7 +1395,7 @@
                 <w:b w:val="0"/>
                 <w:sz w:val="18"/>
               </w:rPr>
-              <w:t>可免费换绑，不累计次数</w:t>
+              <w:t>不累计，不失效</w:t>
             </w:r>
           </w:p>
         </w:tc>
@@ -1424,7 +1419,7 @@
                 <w:b w:val="0"/>
                 <w:sz w:val="18"/>
               </w:rPr>
-              <w:t>未使用则一直有效</w:t>
+              <w:t>使用前保留</w:t>
             </w:r>
           </w:p>
         </w:tc>
@@ -1477,7 +1472,7 @@
                 <w:b w:val="0"/>
                 <w:sz w:val="18"/>
               </w:rPr>
-              <w:t>免费优先，否则扣一次额度</w:t>
+              <w:t>免费优先，否则扣一次</w:t>
             </w:r>
           </w:p>
         </w:tc>
@@ -1501,7 +1496,7 @@
                 <w:b w:val="0"/>
                 <w:sz w:val="18"/>
               </w:rPr>
-              <w:t>重新开始冷却</w:t>
+              <w:t>重新开始</w:t>
             </w:r>
           </w:p>
         </w:tc>
@@ -1554,7 +1549,7 @@
                 <w:b w:val="0"/>
                 <w:sz w:val="18"/>
               </w:rPr>
-              <w:t>免费优先，否则扣一次；旧设备停止续期</w:t>
+              <w:t>按规则扣费；旧设备停续期</w:t>
             </w:r>
           </w:p>
         </w:tc>
@@ -1631,7 +1626,7 @@
                 <w:b w:val="0"/>
                 <w:sz w:val="18"/>
               </w:rPr>
-              <w:t>已处理额度，不再次扣除</w:t>
+              <w:t>不再次扣除</w:t>
             </w:r>
           </w:p>
         </w:tc>
@@ -1761,7 +1756,7 @@
                 <w:b w:val="0"/>
                 <w:sz w:val="18"/>
               </w:rPr>
-              <w:t>相同设备密钥重验</w:t>
+              <w:t>密钥与摘要相同</w:t>
             </w:r>
           </w:p>
         </w:tc>
@@ -1899,12 +1894,17 @@
     </w:p>
     <w:p>
       <w:r>
-        <w:t>月份按配置的固定 UTC 偏移计算，保留时分秒并将月末夹取为目标月有效日期。产品可设置三个月与 UTC+8；例如 1 月 31 日首次激活，4 月 30 日免费资格成熟。此规则不是固定 90 天，也没有领取期限。</w:t>
+        <w:t>月份使用配置的 UTC 偏移，保留时分秒，月末取目标月有效日。例如 UTC+8 的 1 月 31 日激活，4 月 30 日成熟，不是固定 90 天。重置需核对代次与费用；幂等重试不重复扣费，未绑定或等待重绑时不可再重置。</w:t>
       </w:r>
     </w:p>
     <w:p>
       <w:r>
-        <w:t>自助重置须核对当前绑定代次和本次费用，重复请求不重复扣减；未绑定或正在等待重新绑定时不可再次重置。旧挑战失效，已有离线许可证仍可持续至原到期时间。设备公钥丢失不能仅凭相同 HWID 自动恢复。换绑、额度扣减、挑战消费与审计在同一事务提交，失败回滚；需要重试的命令使用幂等键。</w:t>
+        <w:t>revokeAccess 撤销会话与未完成挑战，可同时停用设备续期。它不赠送换绑次数、不改变冷却，保留已经付费的重置。宿主还须同事务撤销网页会话、设备申请及确认票据。原离线许可证可用至到期。</w:t>
+      </w:r>
+    </w:p>
+    <w:p>
+      <w:r>
+        <w:br w:type="page"/>
       </w:r>
     </w:p>
     <w:p>
@@ -2516,7 +2516,7 @@
     </w:p>
     <w:p>
       <w:r>
-        <w:t>迁移 2 引入账号状态和迁移记录；迁移 3 将权益 order_id 改为可空并增加来源及渠道表，保留已有付款授权。升级前备份，降级应恢复与旧代码匹配的备份，不能只切换旧二进制。</w:t>
+        <w:t>迁移 6 增加 payment_exceptions，保存原订单、账号、实际流水、处理状态和退款或新订单关联。迁移 2 引入账号状态和迁移记录；迁移 3 将权益 order_id 改为可空并增加来源及渠道表，保留已有付款授权。升级前备份，降级应恢复与旧代码匹配的备份，不能只切换旧二进制。</w:t>
       </w:r>
     </w:p>
     <w:p>
@@ -2539,7 +2539,7 @@
     </w:p>
     <w:p>
       <w:r>
-        <w:t>服务器与设备分别持有独立 Ed25519 密钥。许可证默认有效 15 分钟，包含账号、产品、收费版本、设备、公钥指纹、绑定代次和有效期；客户端必须同时核实签名与预期范围。验签公钥需由可信发布渠道预置或更新，不能信任任意响应携带的新公钥。</w:t>
+        <w:t>服务器与设备分别持有独立 Ed25519 密钥。许可证默认有效 15 分钟，包含账号、产品、收费版本、渠道、硬件摘要、设备、公钥指纹、绑定代次和有效期；客户端必须同时核实签名与预期范围。验签公钥需由可信发布渠道预置或更新，不能信任任意响应携带的新公钥。</w:t>
       </w:r>
     </w:p>
     <w:p>
@@ -2674,12 +2674,12 @@
     </w:p>
     <w:p>
       <w:r>
-        <w:t>本次新增订单有效期、过期支付复核、迁移 5 与备份容量扩展。本地构建和 57 项测试通过；此前生产依赖审计未报告已知漏洞。GitHub Actions 曾明确因账号计费锁定而未启动；本地成功不代表远端 CI 通过，也不代表完成真实产品支付或硬件验收。</w:t>
+        <w:t>本次新增异常到账、渠道与摘要许可、安全恢复撤销和迁移 6。本地构建和 62 项测试通过；此前生产依赖审计未报告已知漏洞。GitHub Actions 曾明确因账号计费锁定而未启动；本地成功不代表远端 CI 通过，也不代表完成真实产品支付或硬件验收。</w:t>
       </w:r>
     </w:p>
     <w:p>
       <w:r>
-        <w:t>当前代码版本为 0.4.0，Git 标签 v0.4.0 固定该版本的功能提交。Git main 保存集成代码，短期分支通过 PR 合并。收费版本、软件构建版本、分发渠道与 Git 分支相互独立；运行数据库、私钥、环境配置和客户文件不得进入 Git。</w:t>
+        <w:t>当前代码版本为 0.5.0。接入时固定审核合并后的提交或对应标签；SDK 新增必填的预期 fingerprint，旧许可证需重新签发。Git main 保存集成代码，短期分支通过 PR 合并。收费版本、软件构建版本、分发渠道与 Git 分支相互独立；运行数据库、私钥、环境配置和客户文件不得进入 Git。</w:t>
       </w:r>
     </w:p>
     <w:p>

</xml_diff>

<commit_message>
fix: enforce device and license scope and reconcile exceptional payments (#11)
</commit_message>
<xml_diff>
--- a/docs/SYSTEM-GUIDE.docx
+++ b/docs/SYSTEM-GUIDE.docx
@@ -12,7 +12,7 @@
     </w:p>
     <w:p>
       <w:r>
-        <w:t>更新日期：2026 年 10 月 31 日 CST。适用代码：0.4.0，包含设备自助重置、订单有效期与迁移 5。已发布 Git 标签 v0.4.0，未发布 npm 包。</w:t>
+        <w:t>更新日期：2026 年 10 月 31 日 CST。适用代码：0.5.0，包含安全恢复、渠道许可证、异常到账和迁移 6。Git 标签固定发布版本，未发布 npm 包。</w:t>
       </w:r>
     </w:p>
     <w:p>
@@ -1114,7 +1114,7 @@
         <w:t>hasReleaseAccess</w:t>
       </w:r>
       <w:r>
-        <w:t xml:space="preserve"> 检查账号状态、有效版本权益和同版渠道资格。实际下载服务必须调用渠道鉴权；当前设备许可证不携带 Beta 条件，不能把发布说明过滤当作完整客户端渠道保护。</w:t>
+        <w:t xml:space="preserve"> 检查账号状态、有效版本权益和同版渠道资格。实际下载服务必须调用渠道鉴权；许可证也签入 stable/beta 渠道和硬件摘要；签发与 SDK 验证都检查范围。撤销版本权益会清除 Beta，重新购买普通版不恢复旧 Beta。</w:t>
       </w:r>
     </w:p>
     <w:p>
@@ -1144,22 +1144,17 @@
     </w:p>
     <w:p>
       <w:r>
-        <w:t>新订单默认 24 小时有效，宿主可通过 orderTtlSeconds 配置 60 秒至 30 天。升级前的待付款订单从首次升级时获得完整宽限期。order_deadlines 使用独立附表，保留现有订单和外键结构。即使定时任务尚未执行，查询和确认付款仍即时检查有效期。</w:t>
+        <w:t>订单默认 24 小时有效，可配置 60 秒至 30 天。旧待付订单在首次升级时取得完整宽限期。独立附表保存截止时间；查询及核款即时检查，不依赖定时清理。</w:t>
       </w:r>
     </w:p>
     <w:p>
       <w:r>
-        <w:t>过期订单显示 expired，清理后底层状态为 cancelled 并保留过期原因和审计。人工取消与自动过期分开处理；人工取消不可重新发放。过期后确实到账，管理员须核实金额、币种和唯一流水并提供 latePaymentReason 后才能发放，原资格检查依旧有效。无法发放或金额不符须人工退款/协商，系统不会伪造退款结果。</w:t>
+        <w:t>人工取消与过期分开处理。取消订单不能直接发放；过期单须提供 latePaymentReason。核款必须验证实际收款、金额、币种、唯一流水及购买资格。价格保存为订单快照，调价不改变旧单。</w:t>
       </w:r>
     </w:p>
     <w:p>
       <w:r>
-        <w:t>订单保存商品和价格快照，金额为最小货币单位整数。调价只影响之后创建的订单。人工核实须依据真实收款记录，提交渠道、交易流水、金额和币种；付款截图、客户端提示和跳转成功均不是支付凭证。</w:t>
-      </w:r>
-    </w:p>
-    <w:p>
-      <w:r>
-        <w:t>订单确认、权益或额度发放、审计和通知事件在事务中完成。渠道与流水号唯一，重复确认同一交易不重复发放；不同交易确认已支付订单产生冲突。两笔订单重复购买同一版本时，不重复授予权益，多付金额需要运营处理。当前没有退款和自动对账实现。</w:t>
+        <w:t>确认、发放、审计与通知在同一事务完成。异常到账先独立登记，再用于同账号新订单，或登记已完成的人工退款。订单与异常记录间统一防重用。系统不执行自动退款，也不把付款截图当作到账证据。</w:t>
       </w:r>
     </w:p>
     <w:p>
@@ -1172,7 +1167,7 @@
     </w:p>
     <w:p>
       <w:r>
-        <w:t>每个账号在每个设备组只保留一台有效设备。同组产品共享设备、冷却与额外额度；不同组独立。硬件摘要只作关联信息，激活必须验证设备 Ed25519 私钥持有证明。</w:t>
+        <w:t>同组产品共享一台有效设备、冷却与额度，不同组独立。激活验证 Ed25519 私钥；同密钥但摘要变化按换绑处理。私钥与摘要同时复制仍须由原生端可信硬件措施解决。</w:t>
       </w:r>
     </w:p>
     <w:tbl>
@@ -1347,7 +1342,7 @@
                 <w:b w:val="0"/>
                 <w:sz w:val="18"/>
               </w:rPr>
-              <w:t>开始配置的自然月冷却</w:t>
+              <w:t>开始自然月冷却</w:t>
             </w:r>
           </w:p>
         </w:tc>
@@ -1400,7 +1395,7 @@
                 <w:b w:val="0"/>
                 <w:sz w:val="18"/>
               </w:rPr>
-              <w:t>可免费换绑，不累计次数</w:t>
+              <w:t>不累计，不失效</w:t>
             </w:r>
           </w:p>
         </w:tc>
@@ -1424,7 +1419,7 @@
                 <w:b w:val="0"/>
                 <w:sz w:val="18"/>
               </w:rPr>
-              <w:t>未使用则一直有效</w:t>
+              <w:t>使用前保留</w:t>
             </w:r>
           </w:p>
         </w:tc>
@@ -1477,7 +1472,7 @@
                 <w:b w:val="0"/>
                 <w:sz w:val="18"/>
               </w:rPr>
-              <w:t>免费优先，否则扣一次额度</w:t>
+              <w:t>免费优先，否则扣一次</w:t>
             </w:r>
           </w:p>
         </w:tc>
@@ -1501,7 +1496,7 @@
                 <w:b w:val="0"/>
                 <w:sz w:val="18"/>
               </w:rPr>
-              <w:t>重新开始冷却</w:t>
+              <w:t>重新开始</w:t>
             </w:r>
           </w:p>
         </w:tc>
@@ -1554,7 +1549,7 @@
                 <w:b w:val="0"/>
                 <w:sz w:val="18"/>
               </w:rPr>
-              <w:t>免费优先，否则扣一次；旧设备停止续期</w:t>
+              <w:t>按规则扣费；旧设备停续期</w:t>
             </w:r>
           </w:p>
         </w:tc>
@@ -1631,7 +1626,7 @@
                 <w:b w:val="0"/>
                 <w:sz w:val="18"/>
               </w:rPr>
-              <w:t>已处理额度，不再次扣除</w:t>
+              <w:t>不再次扣除</w:t>
             </w:r>
           </w:p>
         </w:tc>
@@ -1761,7 +1756,7 @@
                 <w:b w:val="0"/>
                 <w:sz w:val="18"/>
               </w:rPr>
-              <w:t>相同设备密钥重验</w:t>
+              <w:t>密钥与摘要相同</w:t>
             </w:r>
           </w:p>
         </w:tc>
@@ -1899,12 +1894,17 @@
     </w:p>
     <w:p>
       <w:r>
-        <w:t>月份按配置的固定 UTC 偏移计算，保留时分秒并将月末夹取为目标月有效日期。产品可设置三个月与 UTC+8；例如 1 月 31 日首次激活，4 月 30 日免费资格成熟。此规则不是固定 90 天，也没有领取期限。</w:t>
+        <w:t>月份使用配置的 UTC 偏移，保留时分秒，月末取目标月有效日。例如 UTC+8 的 1 月 31 日激活，4 月 30 日成熟，不是固定 90 天。重置需核对代次与费用；幂等重试不重复扣费，未绑定或等待重绑时不可再重置。</w:t>
       </w:r>
     </w:p>
     <w:p>
       <w:r>
-        <w:t>自助重置须核对当前绑定代次和本次费用，重复请求不重复扣减；未绑定或正在等待重新绑定时不可再次重置。旧挑战失效，已有离线许可证仍可持续至原到期时间。设备公钥丢失不能仅凭相同 HWID 自动恢复。换绑、额度扣减、挑战消费与审计在同一事务提交，失败回滚；需要重试的命令使用幂等键。</w:t>
+        <w:t>revokeAccess 撤销会话与未完成挑战，可同时停用设备续期。它不赠送换绑次数、不改变冷却，保留已经付费的重置。宿主还须同事务撤销网页会话、设备申请及确认票据。原离线许可证可用至到期。</w:t>
+      </w:r>
+    </w:p>
+    <w:p>
+      <w:r>
+        <w:br w:type="page"/>
       </w:r>
     </w:p>
     <w:p>
@@ -2516,7 +2516,7 @@
     </w:p>
     <w:p>
       <w:r>
-        <w:t>迁移 2 引入账号状态和迁移记录；迁移 3 将权益 order_id 改为可空并增加来源及渠道表，保留已有付款授权。升级前备份，降级应恢复与旧代码匹配的备份，不能只切换旧二进制。</w:t>
+        <w:t>迁移 6 增加 payment_exceptions，保存原订单、账号、实际流水、处理状态和退款或新订单关联。迁移 2 引入账号状态和迁移记录；迁移 3 将权益 order_id 改为可空并增加来源及渠道表，保留已有付款授权。升级前备份，降级应恢复与旧代码匹配的备份，不能只切换旧二进制。</w:t>
       </w:r>
     </w:p>
     <w:p>
@@ -2539,7 +2539,7 @@
     </w:p>
     <w:p>
       <w:r>
-        <w:t>服务器与设备分别持有独立 Ed25519 密钥。许可证默认有效 15 分钟，包含账号、产品、收费版本、设备、公钥指纹、绑定代次和有效期；客户端必须同时核实签名与预期范围。验签公钥需由可信发布渠道预置或更新，不能信任任意响应携带的新公钥。</w:t>
+        <w:t>服务器与设备分别持有独立 Ed25519 密钥。许可证默认有效 15 分钟，包含账号、产品、收费版本、渠道、硬件摘要、设备、公钥指纹、绑定代次和有效期；客户端必须同时核实签名与预期范围。验签公钥需由可信发布渠道预置或更新，不能信任任意响应携带的新公钥。</w:t>
       </w:r>
     </w:p>
     <w:p>
@@ -2674,12 +2674,12 @@
     </w:p>
     <w:p>
       <w:r>
-        <w:t>本次新增订单有效期、过期支付复核、迁移 5 与备份容量扩展。本地构建和 57 项测试通过；此前生产依赖审计未报告已知漏洞。GitHub Actions 曾明确因账号计费锁定而未启动；本地成功不代表远端 CI 通过，也不代表完成真实产品支付或硬件验收。</w:t>
+        <w:t>本次新增异常到账、渠道与摘要许可、安全恢复撤销和迁移 6。本地构建和 62 项测试通过；此前生产依赖审计未报告已知漏洞。GitHub Actions 曾明确因账号计费锁定而未启动；本地成功不代表远端 CI 通过，也不代表完成真实产品支付或硬件验收。</w:t>
       </w:r>
     </w:p>
     <w:p>
       <w:r>
-        <w:t>当前代码版本为 0.4.0，Git 标签 v0.4.0 固定该版本的功能提交。Git main 保存集成代码，短期分支通过 PR 合并。收费版本、软件构建版本、分发渠道与 Git 分支相互独立；运行数据库、私钥、环境配置和客户文件不得进入 Git。</w:t>
+        <w:t>当前代码版本为 0.5.0。接入时固定审核合并后的提交或对应标签；SDK 新增必填的预期 fingerprint，旧许可证需重新签发。Git main 保存集成代码，短期分支通过 PR 合并。收费版本、软件构建版本、分发渠道与 Git 分支相互独立；运行数据库、私钥、环境配置和客户文件不得进入 Git。</w:t>
       </w:r>
     </w:p>
     <w:p>

</xml_diff>

<commit_message>
feat: add explicit audited entitlement access management
</commit_message>
<xml_diff>
--- a/docs/SYSTEM-GUIDE.docx
+++ b/docs/SYSTEM-GUIDE.docx
@@ -12,7 +12,7 @@
     </w:p>
     <w:p>
       <w:r>
-        <w:t>更新日期：2026 年 10 月 31 日 CST。适用代码：0.5.0，包含安全恢复、渠道许可证、异常到账和迁移 6。Git 标签固定发布版本，未发布 npm 包。</w:t>
+        <w:t>更新日期：2026 年 11 月 1 日 CST。适用代码：0.6.0，包含安全恢复、渠道许可证、异常到账和迁移 6。Git 标签固定发布版本，未发布 npm 包。</w:t>
       </w:r>
     </w:p>
     <w:p>
@@ -2674,12 +2674,17 @@
     </w:p>
     <w:p>
       <w:r>
-        <w:t>本次新增异常到账、渠道与摘要许可、安全恢复撤销和迁移 6。本地构建和 62 项测试通过；此前生产依赖审计未报告已知漏洞。GitHub Actions 曾明确因账号计费锁定而未启动；本地成功不代表远端 CI 通过，也不代表完成真实产品支付或硬件验收。</w:t>
+        <w:t>本次新增异常到账、渠道与摘要许可、安全恢复撤销和迁移 6。本地构建和 64 项测试通过；此前生产依赖审计未报告已知漏洞。GitHub Actions 曾明确因账号计费锁定而未启动；本地成功不代表远端 CI 通过，也不代表完成真实产品支付或硬件验收。</w:t>
       </w:r>
     </w:p>
     <w:p>
       <w:r>
-        <w:t>当前代码版本为 0.5.0。接入时固定审核合并后的提交或对应标签；SDK 新增必填的预期 fingerprint，旧许可证需重新签发。Git main 保存集成代码，短期分支通过 PR 合并。收费版本、软件构建版本、分发渠道与 Git 分支相互独立；运行数据库、私钥、环境配置和客户文件不得进入 Git。</w:t>
+        <w:t>管理员可通过可信宿主接口 setEntitlementAccess 显式设置普通版、同版 Beta 或撤销，也可恢复之前撤销的权益。必须记录原因并提供幂等键；保留已有付款来源，不虚构订单，重放旧命令不覆盖后续变更。普通身份组认领仍不能恢复撤销。平台身份组写入、重试和权限保护由产品适配器负责。</w:t>
+      </w:r>
+    </w:p>
+    <w:p>
+      <w:r>
+        <w:t>当前代码版本为 0.6.0。接入时固定审核合并后的提交或对应标签；SDK 新增必填的预期 fingerprint，旧许可证需重新签发。Git main 保存集成代码，短期分支通过 PR 合并。收费版本、软件构建版本、分发渠道与 Git 分支相互独立；运行数据库、私钥、环境配置和客户文件不得进入 Git。</w:t>
       </w:r>
     </w:p>
     <w:p>

</xml_diff>

<commit_message>
feat: add explicit audited entitlement access management (#12)
</commit_message>
<xml_diff>
--- a/docs/SYSTEM-GUIDE.docx
+++ b/docs/SYSTEM-GUIDE.docx
@@ -12,7 +12,7 @@
     </w:p>
     <w:p>
       <w:r>
-        <w:t>更新日期：2026 年 10 月 31 日 CST。适用代码：0.5.0，包含安全恢复、渠道许可证、异常到账和迁移 6。Git 标签固定发布版本，未发布 npm 包。</w:t>
+        <w:t>更新日期：2026 年 11 月 1 日 CST。适用代码：0.6.0，包含安全恢复、渠道许可证、异常到账和迁移 6。Git 标签固定发布版本，未发布 npm 包。</w:t>
       </w:r>
     </w:p>
     <w:p>
@@ -2674,12 +2674,17 @@
     </w:p>
     <w:p>
       <w:r>
-        <w:t>本次新增异常到账、渠道与摘要许可、安全恢复撤销和迁移 6。本地构建和 62 项测试通过；此前生产依赖审计未报告已知漏洞。GitHub Actions 曾明确因账号计费锁定而未启动；本地成功不代表远端 CI 通过，也不代表完成真实产品支付或硬件验收。</w:t>
+        <w:t>本次新增异常到账、渠道与摘要许可、安全恢复撤销和迁移 6。本地构建和 64 项测试通过；此前生产依赖审计未报告已知漏洞。GitHub Actions 曾明确因账号计费锁定而未启动；本地成功不代表远端 CI 通过，也不代表完成真实产品支付或硬件验收。</w:t>
       </w:r>
     </w:p>
     <w:p>
       <w:r>
-        <w:t>当前代码版本为 0.5.0。接入时固定审核合并后的提交或对应标签；SDK 新增必填的预期 fingerprint，旧许可证需重新签发。Git main 保存集成代码，短期分支通过 PR 合并。收费版本、软件构建版本、分发渠道与 Git 分支相互独立；运行数据库、私钥、环境配置和客户文件不得进入 Git。</w:t>
+        <w:t>管理员可通过可信宿主接口 setEntitlementAccess 显式设置普通版、同版 Beta 或撤销，也可恢复之前撤销的权益。必须记录原因并提供幂等键；保留已有付款来源，不虚构订单，重放旧命令不覆盖后续变更。普通身份组认领仍不能恢复撤销。平台身份组写入、重试和权限保护由产品适配器负责。</w:t>
+      </w:r>
+    </w:p>
+    <w:p>
+      <w:r>
+        <w:t>当前代码版本为 0.6.0。接入时固定审核合并后的提交或对应标签；SDK 新增必填的预期 fingerprint，旧许可证需重新签发。Git main 保存集成代码，短期分支通过 PR 合并。收费版本、软件构建版本、分发渠道与 Git 分支相互独立；运行数据库、私钥、环境配置和客户文件不得进入 Git。</w:t>
       </w:r>
     </w:p>
     <w:p>

</xml_diff>